<commit_message>
Make notebook, slides, script and proposal accessible to non-technical readers
- Notebook: plain-English overview, jargon glossary and an 'In plain English'
  box at the start of every section
- Slides: new 'project in plain English' and 'jargon buster' slides, plain
  takeaway strips and simpler labels on technical slides
- Script: key message + plain talking points per slide, technical detail
  moved to 'If asked' notes; slide numbers match the 18-slide deck
- Proposal: plain-English summary and glossary of key terms
- README: plain-English summary

Co-Authored-By: Claude Opus 5.5 <noreply@anthropic.com>
</commit_message>
<xml_diff>
--- a/docs/Project Proposal.docx
+++ b/docs/Project Proposal.docx
@@ -24,6 +24,60 @@
         </w:rPr>
         <w:t>Project Plan: Variational Inference for GARCH-Family Models</w:t>
       </w:r>
+    </w:p>
+    <w:p>
+      <w:pPr>
+        <w:spacing w:after="0" w:line="360" w:lineRule="auto"/>
+        <w:outlineLvl w:val="3"/>
+        <w:rPr>
+          <w:rFonts w:ascii="Times New Roman" w:eastAsia="Times New Roman" w:hAnsi="Times New Roman" w:cs="Times New Roman"/>
+          <w:b/>
+          <w:bCs/>
+          <w:kern w:val="0"/>
+          <w14:ligatures w14:val="none"/>
+        </w:rPr>
+      </w:pPr>
+      <w:r>
+        <w:rPr>
+          <w:rFonts w:ascii="Times New Roman" w:eastAsia="Times New Roman" w:hAnsi="Times New Roman" w:cs="Times New Roman"/>
+          <w:b/>
+          <w:bCs/>
+          <w:kern w:val="0"/>
+          <w14:ligatures w14:val="none"/>
+        </w:rPr>
+        <w:t>Summary in Plain English</w:t>
+      </w:r>
+    </w:p>
+    <w:p>
+      <w:pPr>
+        <w:spacing w:after="0" w:line="360" w:lineRule="auto"/>
+        <w:rPr>
+          <w:rFonts w:ascii="Times New Roman" w:eastAsia="Times New Roman" w:hAnsi="Times New Roman" w:cs="Times New Roman"/>
+          <w:kern w:val="0"/>
+          <w14:ligatures w14:val="none"/>
+        </w:rPr>
+      </w:pPr>
+      <w:proofErr w:type="spellStart"/>
+      <w:proofErr w:type="spellEnd"/>
+      <w:r>
+        <w:rPr>
+          <w:rFonts w:ascii="Times New Roman" w:eastAsia="Times New Roman" w:hAnsi="Times New Roman" w:cs="Times New Roman"/>
+          <w:kern w:val="0"/>
+          <w14:ligatures w14:val="none"/>
+        </w:rPr>
+        <w:t>Stock prices swing more on some days than others, and stormy periods tend to cluster, much like the weather. This “volatility” is what banks and investors need to forecast in order to manage risk. The standard forecasting model is called GARCH. Fitting it the Bayesian way gives not just a forecast but a measure of how sure we can be, yet the traditional Bayesian tool (MCMC) works by slow trial and error. This project tests whether a faster-in-principle machine-learning shortcut, Variational Inference (VI), gives the same answers. We re-run the Microsoft example from Magris and Iosifidis (2023), check our numbers against theirs, compare the forecasts on data the models have not seen, and repeat the test on the largest US companies. Technical terms are explained in the glossary (Section 6).</w:t>
+      </w:r>
+    </w:p>
+    <w:p>
+      <w:pPr>
+        <w:spacing w:after="0" w:line="360" w:lineRule="auto"/>
+        <w:rPr>
+          <w:rFonts w:ascii="Times New Roman" w:eastAsia="Times New Roman" w:hAnsi="Times New Roman" w:cs="Times New Roman"/>
+          <w:kern w:val="0"/>
+          <w:lang w:val="en-US"/>
+          <w14:ligatures w14:val="none"/>
+        </w:rPr>
+      </w:pPr>
     </w:p>
     <w:p>
       <w:pPr>
@@ -858,6 +912,7 @@
         <w:rPr>
           <w:rFonts w:ascii="Times New Roman" w:eastAsia="Times New Roman" w:hAnsi="Times New Roman" w:cs="Times New Roman"/>
           <w:kern w:val="0"/>
+          <w:lang w:val="en-US"/>
           <w14:ligatures w14:val="none"/>
         </w:rPr>
       </w:pPr>
@@ -882,17 +937,370 @@
           <w:kern w:val="0"/>
           <w14:ligatures w14:val="none"/>
         </w:rPr>
-        <w:t xml:space="preserve">6. </w:t>
-      </w:r>
-      <w:r>
+        <w:t>6. Glossary of Key Terms</w:t>
+      </w:r>
+    </w:p>
+    <w:p>
+      <w:pPr>
+        <w:spacing w:after="0" w:line="360" w:lineRule="auto"/>
+        <w:rPr>
+          <w:rFonts w:ascii="Times New Roman" w:eastAsia="Times New Roman" w:hAnsi="Times New Roman" w:cs="Times New Roman"/>
+          <w:kern w:val="0"/>
+          <w14:ligatures w14:val="none"/>
+        </w:rPr>
+      </w:pPr>
+      <w:proofErr w:type="spellStart"/>
+      <w:proofErr w:type="spellEnd"/>
+      <w:r>
+        <w:rPr>
+          <w:rFonts w:ascii="Times New Roman" w:eastAsia="Times New Roman" w:hAnsi="Times New Roman" w:cs="Times New Roman"/>
+          <w:b/>
+          <w:kern w:val="0"/>
+          <w14:ligatures w14:val="none"/>
+        </w:rPr>
+        <w:t xml:space="preserve">Volatility: </w:t>
+      </w:r>
+      <w:r>
+        <w:rPr>
+          <w:rFonts w:ascii="Times New Roman" w:eastAsia="Times New Roman" w:hAnsi="Times New Roman" w:cs="Times New Roman"/>
+          <w:b w:val="0"/>
+          <w:kern w:val="0"/>
+          <w14:ligatures w14:val="none"/>
+        </w:rPr>
+        <w:t>how large the daily price swings are.</w:t>
+      </w:r>
+    </w:p>
+    <w:p>
+      <w:pPr>
+        <w:spacing w:after="0" w:line="360" w:lineRule="auto"/>
+        <w:rPr>
+          <w:rFonts w:ascii="Times New Roman" w:eastAsia="Times New Roman" w:hAnsi="Times New Roman" w:cs="Times New Roman"/>
+          <w:kern w:val="0"/>
+          <w14:ligatures w14:val="none"/>
+        </w:rPr>
+      </w:pPr>
+      <w:proofErr w:type="spellStart"/>
+      <w:proofErr w:type="spellEnd"/>
+      <w:r>
+        <w:rPr>
+          <w:rFonts w:ascii="Times New Roman" w:eastAsia="Times New Roman" w:hAnsi="Times New Roman" w:cs="Times New Roman"/>
+          <w:b/>
+          <w:kern w:val="0"/>
+          <w14:ligatures w14:val="none"/>
+        </w:rPr>
+        <w:t xml:space="preserve">GARCH(1,1): </w:t>
+      </w:r>
+      <w:r>
+        <w:rPr>
+          <w:rFonts w:ascii="Times New Roman" w:eastAsia="Times New Roman" w:hAnsi="Times New Roman" w:cs="Times New Roman"/>
+          <w:b w:val="0"/>
+          <w:kern w:val="0"/>
+          <w14:ligatures w14:val="none"/>
+        </w:rPr>
+        <w:t>a model that forecasts today’s volatility from yesterday’s price shock (α) and yesterday’s volatility (β), plus a baseline (ω).</w:t>
+      </w:r>
+    </w:p>
+    <w:p>
+      <w:pPr>
+        <w:spacing w:after="0" w:line="360" w:lineRule="auto"/>
+        <w:rPr>
+          <w:rFonts w:ascii="Times New Roman" w:eastAsia="Times New Roman" w:hAnsi="Times New Roman" w:cs="Times New Roman"/>
+          <w:kern w:val="0"/>
+          <w14:ligatures w14:val="none"/>
+        </w:rPr>
+      </w:pPr>
+      <w:proofErr w:type="spellStart"/>
+      <w:proofErr w:type="spellEnd"/>
+      <w:r>
+        <w:rPr>
+          <w:rFonts w:ascii="Times New Roman" w:eastAsia="Times New Roman" w:hAnsi="Times New Roman" w:cs="Times New Roman"/>
+          <w:b/>
+          <w:kern w:val="0"/>
+          <w14:ligatures w14:val="none"/>
+        </w:rPr>
+        <w:t xml:space="preserve">Stationarity: </w:t>
+      </w:r>
+      <w:r>
+        <w:rPr>
+          <w:rFonts w:ascii="Times New Roman" w:eastAsia="Times New Roman" w:hAnsi="Times New Roman" w:cs="Times New Roman"/>
+          <w:b w:val="0"/>
+          <w:kern w:val="0"/>
+          <w14:ligatures w14:val="none"/>
+        </w:rPr>
+        <w:t>the condition α + β &lt; 1, which means shocks eventually fade and volatility cannot explode.</w:t>
+      </w:r>
+    </w:p>
+    <w:p>
+      <w:pPr>
+        <w:spacing w:after="0" w:line="360" w:lineRule="auto"/>
+        <w:rPr>
+          <w:rFonts w:ascii="Times New Roman" w:eastAsia="Times New Roman" w:hAnsi="Times New Roman" w:cs="Times New Roman"/>
+          <w:kern w:val="0"/>
+          <w14:ligatures w14:val="none"/>
+        </w:rPr>
+      </w:pPr>
+      <w:proofErr w:type="spellStart"/>
+      <w:proofErr w:type="spellEnd"/>
+      <w:r>
+        <w:rPr>
+          <w:rFonts w:ascii="Times New Roman" w:eastAsia="Times New Roman" w:hAnsi="Times New Roman" w:cs="Times New Roman"/>
+          <w:b/>
+          <w:kern w:val="0"/>
+          <w14:ligatures w14:val="none"/>
+        </w:rPr>
+        <w:t xml:space="preserve">QML (Quasi-Maximum Likelihood): </w:t>
+      </w:r>
+      <w:r>
+        <w:rPr>
+          <w:rFonts w:ascii="Times New Roman" w:eastAsia="Times New Roman" w:hAnsi="Times New Roman" w:cs="Times New Roman"/>
+          <w:b w:val="0"/>
+          <w:kern w:val="0"/>
+          <w14:ligatures w14:val="none"/>
+        </w:rPr>
+        <w:t>the classic method that finds the single best-fitting set of parameters.</w:t>
+      </w:r>
+    </w:p>
+    <w:p>
+      <w:pPr>
+        <w:spacing w:after="0" w:line="360" w:lineRule="auto"/>
+        <w:rPr>
+          <w:rFonts w:ascii="Times New Roman" w:eastAsia="Times New Roman" w:hAnsi="Times New Roman" w:cs="Times New Roman"/>
+          <w:kern w:val="0"/>
+          <w14:ligatures w14:val="none"/>
+        </w:rPr>
+      </w:pPr>
+      <w:proofErr w:type="spellStart"/>
+      <w:proofErr w:type="spellEnd"/>
+      <w:r>
+        <w:rPr>
+          <w:rFonts w:ascii="Times New Roman" w:eastAsia="Times New Roman" w:hAnsi="Times New Roman" w:cs="Times New Roman"/>
+          <w:b/>
+          <w:kern w:val="0"/>
+          <w14:ligatures w14:val="none"/>
+        </w:rPr>
+        <w:t xml:space="preserve">Prior / posterior: </w:t>
+      </w:r>
+      <w:r>
+        <w:rPr>
+          <w:rFonts w:ascii="Times New Roman" w:eastAsia="Times New Roman" w:hAnsi="Times New Roman" w:cs="Times New Roman"/>
+          <w:b w:val="0"/>
+          <w:kern w:val="0"/>
+          <w14:ligatures w14:val="none"/>
+        </w:rPr>
+        <w:t>what we believe about the parameters before and after seeing the data.</w:t>
+      </w:r>
+    </w:p>
+    <w:p>
+      <w:pPr>
+        <w:spacing w:after="0" w:line="360" w:lineRule="auto"/>
+        <w:rPr>
+          <w:rFonts w:ascii="Times New Roman" w:eastAsia="Times New Roman" w:hAnsi="Times New Roman" w:cs="Times New Roman"/>
+          <w:kern w:val="0"/>
+          <w14:ligatures w14:val="none"/>
+        </w:rPr>
+      </w:pPr>
+      <w:proofErr w:type="spellStart"/>
+      <w:proofErr w:type="spellEnd"/>
+      <w:r>
+        <w:rPr>
+          <w:rFonts w:ascii="Times New Roman" w:eastAsia="Times New Roman" w:hAnsi="Times New Roman" w:cs="Times New Roman"/>
+          <w:b/>
+          <w:kern w:val="0"/>
+          <w14:ligatures w14:val="none"/>
+        </w:rPr>
+        <w:t xml:space="preserve">MCMC (Markov Chain Monte Carlo): </w:t>
+      </w:r>
+      <w:r>
+        <w:rPr>
+          <w:rFonts w:ascii="Times New Roman" w:eastAsia="Times New Roman" w:hAnsi="Times New Roman" w:cs="Times New Roman"/>
+          <w:b w:val="0"/>
+          <w:kern w:val="0"/>
+          <w14:ligatures w14:val="none"/>
+        </w:rPr>
+        <w:t>the traditional Bayesian method, which approximates the posterior with a long random walk.</w:t>
+      </w:r>
+    </w:p>
+    <w:p>
+      <w:pPr>
+        <w:spacing w:after="0" w:line="360" w:lineRule="auto"/>
+        <w:rPr>
+          <w:rFonts w:ascii="Times New Roman" w:eastAsia="Times New Roman" w:hAnsi="Times New Roman" w:cs="Times New Roman"/>
+          <w:kern w:val="0"/>
+          <w14:ligatures w14:val="none"/>
+        </w:rPr>
+      </w:pPr>
+      <w:proofErr w:type="spellStart"/>
+      <w:proofErr w:type="spellEnd"/>
+      <w:r>
+        <w:rPr>
+          <w:rFonts w:ascii="Times New Roman" w:eastAsia="Times New Roman" w:hAnsi="Times New Roman" w:cs="Times New Roman"/>
+          <w:b/>
+          <w:kern w:val="0"/>
+          <w14:ligatures w14:val="none"/>
+        </w:rPr>
+        <w:t xml:space="preserve">Variational Inference (VI): </w:t>
+      </w:r>
+      <w:r>
+        <w:rPr>
+          <w:rFonts w:ascii="Times New Roman" w:eastAsia="Times New Roman" w:hAnsi="Times New Roman" w:cs="Times New Roman"/>
+          <w:b w:val="0"/>
+          <w:kern w:val="0"/>
+          <w14:ligatures w14:val="none"/>
+        </w:rPr>
+        <w:t>a machine-learning method that approximates the posterior with the closest simple (Gaussian) distribution.</w:t>
+      </w:r>
+    </w:p>
+    <w:p>
+      <w:pPr>
+        <w:spacing w:after="0" w:line="360" w:lineRule="auto"/>
+        <w:rPr>
+          <w:rFonts w:ascii="Times New Roman" w:eastAsia="Times New Roman" w:hAnsi="Times New Roman" w:cs="Times New Roman"/>
+          <w:kern w:val="0"/>
+          <w14:ligatures w14:val="none"/>
+        </w:rPr>
+      </w:pPr>
+      <w:proofErr w:type="spellStart"/>
+      <w:proofErr w:type="spellEnd"/>
+      <w:r>
+        <w:rPr>
+          <w:rFonts w:ascii="Times New Roman" w:eastAsia="Times New Roman" w:hAnsi="Times New Roman" w:cs="Times New Roman"/>
+          <w:b/>
+          <w:kern w:val="0"/>
+          <w14:ligatures w14:val="none"/>
+        </w:rPr>
+        <w:t xml:space="preserve">ELBO: </w:t>
+      </w:r>
+      <w:r>
+        <w:rPr>
+          <w:rFonts w:ascii="Times New Roman" w:eastAsia="Times New Roman" w:hAnsi="Times New Roman" w:cs="Times New Roman"/>
+          <w:b w:val="0"/>
+          <w:kern w:val="0"/>
+          <w14:ligatures w14:val="none"/>
+        </w:rPr>
+        <w:t>the score that VI maximises; higher means a closer approximation.</w:t>
+      </w:r>
+    </w:p>
+    <w:p>
+      <w:pPr>
+        <w:spacing w:after="0" w:line="360" w:lineRule="auto"/>
+        <w:rPr>
+          <w:rFonts w:ascii="Times New Roman" w:eastAsia="Times New Roman" w:hAnsi="Times New Roman" w:cs="Times New Roman"/>
+          <w:kern w:val="0"/>
+          <w14:ligatures w14:val="none"/>
+        </w:rPr>
+      </w:pPr>
+      <w:proofErr w:type="spellStart"/>
+      <w:proofErr w:type="spellEnd"/>
+      <w:r>
+        <w:rPr>
+          <w:rFonts w:ascii="Times New Roman" w:eastAsia="Times New Roman" w:hAnsi="Times New Roman" w:cs="Times New Roman"/>
+          <w:b/>
+          <w:kern w:val="0"/>
+          <w14:ligatures w14:val="none"/>
+        </w:rPr>
+        <w:t xml:space="preserve">Train / test split: </w:t>
+      </w:r>
+      <w:r>
+        <w:rPr>
+          <w:rFonts w:ascii="Times New Roman" w:eastAsia="Times New Roman" w:hAnsi="Times New Roman" w:cs="Times New Roman"/>
+          <w:b w:val="0"/>
+          <w:kern w:val="0"/>
+          <w14:ligatures w14:val="none"/>
+        </w:rPr>
+        <w:t>the model learns from the first 75% of the data and is evaluated on the unseen last 25%.</w:t>
+      </w:r>
+    </w:p>
+    <w:p>
+      <w:pPr>
+        <w:spacing w:after="0" w:line="360" w:lineRule="auto"/>
+        <w:rPr>
+          <w:rFonts w:ascii="Times New Roman" w:eastAsia="Times New Roman" w:hAnsi="Times New Roman" w:cs="Times New Roman"/>
+          <w:kern w:val="0"/>
+          <w14:ligatures w14:val="none"/>
+        </w:rPr>
+      </w:pPr>
+      <w:proofErr w:type="spellStart"/>
+      <w:proofErr w:type="spellEnd"/>
+      <w:r>
+        <w:rPr>
+          <w:rFonts w:ascii="Times New Roman" w:eastAsia="Times New Roman" w:hAnsi="Times New Roman" w:cs="Times New Roman"/>
+          <w:b/>
+          <w:kern w:val="0"/>
+          <w14:ligatures w14:val="none"/>
+        </w:rPr>
+        <w:t xml:space="preserve">NLL, RMSE, MAD, QLIK: </w:t>
+      </w:r>
+      <w:r>
+        <w:rPr>
+          <w:rFonts w:ascii="Times New Roman" w:eastAsia="Times New Roman" w:hAnsi="Times New Roman" w:cs="Times New Roman"/>
+          <w:b w:val="0"/>
+          <w:kern w:val="0"/>
+          <w14:ligatures w14:val="none"/>
+        </w:rPr>
+        <w:t>forecast-error measures; lower is better.</w:t>
+      </w:r>
+    </w:p>
+    <w:p>
+      <w:pPr>
+        <w:spacing w:after="0" w:line="360" w:lineRule="auto"/>
+        <w:rPr>
+          <w:rFonts w:ascii="Times New Roman" w:eastAsia="Times New Roman" w:hAnsi="Times New Roman" w:cs="Times New Roman"/>
+          <w:kern w:val="0"/>
+          <w14:ligatures w14:val="none"/>
+        </w:rPr>
+      </w:pPr>
+      <w:proofErr w:type="spellStart"/>
+      <w:proofErr w:type="spellEnd"/>
+      <w:r>
+        <w:rPr>
+          <w:rFonts w:ascii="Times New Roman" w:eastAsia="Times New Roman" w:hAnsi="Times New Roman" w:cs="Times New Roman"/>
+          <w:b/>
+          <w:kern w:val="0"/>
+          <w14:ligatures w14:val="none"/>
+        </w:rPr>
+        <w:t xml:space="preserve">Student-t innovations: </w:t>
+      </w:r>
+      <w:r>
+        <w:rPr>
+          <w:rFonts w:ascii="Times New Roman" w:eastAsia="Times New Roman" w:hAnsi="Times New Roman" w:cs="Times New Roman"/>
+          <w:b w:val="0"/>
+          <w:kern w:val="0"/>
+          <w14:ligatures w14:val="none"/>
+        </w:rPr>
+        <w:t>an alternative to the normal distribution that allows extreme days to occur more often (“fat tails”).</w:t>
+      </w:r>
+    </w:p>
+    <w:p>
+      <w:pPr>
+        <w:spacing w:after="0" w:line="360" w:lineRule="auto"/>
+        <w:rPr>
+          <w:rFonts w:ascii="Times New Roman" w:eastAsia="Times New Roman" w:hAnsi="Times New Roman" w:cs="Times New Roman"/>
+          <w:kern w:val="0"/>
+          <w14:ligatures w14:val="none"/>
+        </w:rPr>
+      </w:pPr>
+    </w:p>
+    <w:p>
+      <w:pPr>
+        <w:spacing w:after="0" w:line="360" w:lineRule="auto"/>
+        <w:outlineLvl w:val="3"/>
         <w:rPr>
           <w:rFonts w:ascii="Times New Roman" w:eastAsia="Times New Roman" w:hAnsi="Times New Roman" w:cs="Times New Roman"/>
           <w:b/>
           <w:bCs/>
-          <w:kern w:val="36"/>
-          <w14:ligatures w14:val="none"/>
-        </w:rPr>
-        <w:t>References</w:t>
+          <w:kern w:val="0"/>
+          <w14:ligatures w14:val="none"/>
+        </w:rPr>
+      </w:pPr>
+      <w:r>
+        <w:rPr>
+          <w:rFonts w:ascii="Times New Roman" w:eastAsia="Times New Roman" w:hAnsi="Times New Roman" w:cs="Times New Roman"/>
+          <w:b/>
+          <w:bCs/>
+          <w:kern w:val="0"/>
+          <w14:ligatures w14:val="none"/>
+        </w:rPr>
+        <w:t>7. References</w:t>
       </w:r>
     </w:p>
     <w:p>

</xml_diff>